<commit_message>
Complete Clean Code Step 5 documentation
</commit_message>
<xml_diff>
--- a/Docs/MinecraftBuilder_Codex_Gemini_Prompt_Roadmap_VI.docx
+++ b/Docs/MinecraftBuilder_Codex_Gemini_Prompt_Roadmap_VI.docx
@@ -1,6 +1,6 @@
 
 <file path=word/document.xml><?xml version="1.0" encoding="utf-8"?>
-<w:document xmlns:wpc="http://schemas.microsoft.com/office/word/2010/wordprocessingCanvas" xmlns:mo="http://schemas.microsoft.com/office/mac/office/2008/main" xmlns:mc="http://schemas.openxmlformats.org/markup-compatibility/2006" xmlns:mv="urn:schemas-microsoft-com:mac:vml" xmlns:o="urn:schemas-microsoft-com:office:office" xmlns:r="http://schemas.openxmlformats.org/officeDocument/2006/relationships" xmlns:m="http://schemas.openxmlformats.org/officeDocument/2006/math" xmlns:v="urn:schemas-microsoft-com:vml" xmlns:wp14="http://schemas.microsoft.com/office/word/2010/wordprocessingDrawing" xmlns:wp="http://schemas.openxmlformats.org/drawingml/2006/wordprocessingDrawing" xmlns:w10="urn:schemas-microsoft-com:office:word" xmlns:w="http://schemas.openxmlformats.org/wordprocessingml/2006/main" xmlns:w14="http://schemas.microsoft.com/office/word/2010/wordml" xmlns:wpg="http://schemas.microsoft.com/office/word/2010/wordprocessingGroup" xmlns:wpi="http://schemas.microsoft.com/office/word/2010/wordprocessingInk" xmlns:wne="http://schemas.microsoft.com/office/word/2006/wordml" xmlns:wps="http://schemas.microsoft.com/office/word/2010/wordprocessingShape" mc:Ignorable="w14 wp14">
+<w:document xmlns:ns1="http://schemas.openxmlformats.org/markup-compatibility/2006" xmlns:ns2="http://schemas.openxmlformats.org/officeDocument/2006/relationships" xmlns:w="http://schemas.openxmlformats.org/wordprocessingml/2006/main" ns1:Ignorable="w14 wp14">
   <w:body>
     <w:p>
       <w:pPr>
@@ -53,7 +53,7 @@
           <w:color w:val="595959"/>
           <w:sz w:val="20"/>
         </w:rPr>
-        <w:t>Dựa trên MinecraftBuilder Requirements v0.2</w:t>
+        <w:t xml:space="preserve">Dựa trên MinecraftBuilder Requirements v0.2 — roadmap lịch sử; current source và canonical contracts trong Docs/README.md được ưu tiên</w:t>
       </w:r>
     </w:p>
     <w:tbl>
@@ -185,7 +185,7 @@
         <w:ind w:left="360"/>
       </w:pPr>
       <w:r>
-        <w:t>☐ Requirement hiện hành nằm trong Docs/ và là nguồn yêu cầu chính.</w:t>
+        <w:t xml:space="preserve">☐ Dùng Docs/README.md để tìm canonical docs; Requirements v0.2 là product-intent baseline, còn implementation phải được xác minh trong source/tests hiện tại.</w:t>
       </w:r>
     </w:p>
     <w:p>
@@ -301,9 +301,9 @@
               <w:t>Bạn đang làm việc trên repository MinecraftBuilderWeb của dự án MinecraftBuilder.</w:t>
               <w:br/>
               <w:br/>
-              <w:t>Trước khi sửa code:</w:t>
-              <w:br/>
-              <w:t>1. Đọc tài liệu requirement hiện hành trong Docs/.</w:t>
+              <w:t xml:space="preserve">Trước khi sửa code: </w:t>
+              <w:br/>
+              <w:t xml:space="preserve">1. Dùng Docs/README.md để tìm canonical contracts; requirements v0.2 mô tả ý định sản phẩm, còn trạng thái cần kiểm tra trong source/tests hiện tại.</w:t>
               <w:br/>
               <w:t>2. Inspect code hiện tại và package/config thực tế; không đoán cấu trúc đã tồn tại.</w:t>
               <w:br/>
@@ -378,7 +378,7 @@
               <w:spacing w:after="20"/>
             </w:pPr>
             <w:r>
-              <w:t>Nếu Codex/Gemini không đọc được Docs/MinecraftBuilder_Requirements_VI_Final.docx một cách đáng tin cậy, đừng cho AI tự suy diễn requirement.</w:t>
+              <w:t xml:space="preserve">Nếu Codex/Gemini không đọc được Docs/MinecraftBuilder_Requirements_VI.docx một cách đáng tin cậy, đừng cho AI tự suy diễn requirement.</w:t>
             </w:r>
           </w:p>
           <w:p>
@@ -5238,8 +5238,8 @@
       </w:pPr>
     </w:p>
     <w:sectPr>
-      <w:footerReference w:type="default" r:id="rId9"/>
-      <w:headerReference w:type="default" r:id="rId10"/>
+      <w:footerReference w:type="default" ns2:id="rId9"/>
+      <w:headerReference w:type="default" ns2:id="rId10"/>
       <w:pgSz w:w="12240" w:h="15840"/>
       <w:pgMar w:top="936" w:right="1037" w:bottom="936" w:left="1037" w:header="720" w:footer="720" w:gutter="0"/>
       <w:cols w:space="720"/>

</xml_diff>